<commit_message>
feat(programme): le kiosque 10 devient « Mini-Série TESTY »
Une seule ligne change dans la page servie. Tout le reste suit : les dix
affiches A3, les écrans, la présentation, la diapo en main, la variante
programme-kiosques et les fiches de scène sont régénérés — ils lisent tous le
titre dans la page.

Effet de bord à noter plutôt qu'à taire : « libre service » disparaît du titre.
La page ne prend donc plus parti dans la contradiction du § 16 du conducteur,
où le fichier source annonce un visionnage libre et le conducteur du 10/09 une
diffusion présentée de l'épisode 4. La question reste ouverte, l'alerte reste
sur la carte de pitch du kiosque 10.

Co-Authored-By: Claude Opus 5 <noreply@anthropic.com>
Claude-Session: https://claude.ai/code/session_01Pwjz3VzeEknRuHTVSBE4Pa
</commit_message>
<xml_diff>
--- a/outils/fiches/fiches-animateurs.docx
+++ b/outils/fiches/fiches-animateurs.docx
@@ -4558,7 +4558,7 @@
                 <w:color w:val="4A4A49"/>
                 <w:sz w:val="22"/>
               </w:rPr>
-              <w:t>Vidéo TESTY — libre service</w:t>
+              <w:t>Mini-Série TESTY</w:t>
             </w:r>
           </w:p>
         </w:tc>
@@ -13593,7 +13593,7 @@
                 <w:color w:val="1A1A2E"/>
                 <w:sz w:val="22"/>
               </w:rPr>
-              <w:t>Vidéo TESTY — libre service</w:t>
+              <w:t>Mini-Série TESTY</w:t>
             </w:r>
           </w:p>
         </w:tc>
@@ -15723,7 +15723,7 @@
           <w:color w:val="1A1A2E"/>
           <w:sz w:val="38"/>
         </w:rPr>
-        <w:t>Vidéo TESTY — libre service</w:t>
+        <w:t>Mini-Série TESTY</w:t>
       </w:r>
     </w:p>
     <w:tbl>
@@ -15765,7 +15765,7 @@
                 <w:color w:val="B32D2D"/>
                 <w:sz w:val="24"/>
               </w:rPr>
-              <w:t>« Libre service » selon la page ; diffusion présentée de l’épisode 4 selon le conducteur du 10/09. À trancher avant de le dire.</w:t>
+              <w:t>Le fichier source finit par « visionnage en libre service » ; le conducteur du 10/09 décrit une diffusion présentée de l’épisode 4. À trancher avant de le dire.</w:t>
             </w:r>
           </w:p>
         </w:tc>

</xml_diff>

<commit_message>
fix(programme): Erwan PERIGAULT est USR, pas SDSI
Cinq endroits, dont la page servie et les deux cartes de scène qui nomment la
table ronde. « SDSI » reste ailleurs : c'est le nom du kiosque 7, sans rapport.

Co-Authored-By: Claude Opus 5 <noreply@anthropic.com>
Claude-Session: https://claude.ai/code/session_01Pwjz3VzeEknRuHTVSBE4Pa
</commit_message>
<xml_diff>
--- a/outils/fiches/fiches-animateurs.docx
+++ b/outils/fiches/fiches-animateurs.docx
@@ -1885,7 +1885,7 @@
           <w:color w:val="1A1A2E"/>
           <w:sz w:val="28"/>
         </w:rPr>
-        <w:t>Table ronde — Mode produit et les tests. Ghislaine DOPIERRE (TFC), Grégory BARRANCO (TMV), Erwan PERIGAULT (SDSI), animée par Fabrice CHATRON. Remercie les intervenants.</w:t>
+        <w:t>Table ronde — Mode produit et les tests. Ghislaine DOPIERRE (TFC), Grégory BARRANCO (TMV), Erwan PERIGAULT (USR), animée par Fabrice CHATRON. Remercie les intervenants.</w:t>
       </w:r>
     </w:p>
     <w:p>
@@ -10211,7 +10211,7 @@
           <w:color w:val="1A1A2E"/>
           <w:sz w:val="28"/>
         </w:rPr>
-        <w:t>Avec toi : Grégory BARRANCO (TMV) et Erwan PERIGAULT (SDSI).</w:t>
+        <w:t>Avec toi : Grégory BARRANCO (TMV) et Erwan PERIGAULT (USR).</w:t>
       </w:r>
     </w:p>
     <w:p>

</xml_diff>

<commit_message>
fix(programme): « DF Dommages » avec un s, kiosques 7 et 9
L'entité s'écrit au pluriel. Deux occurrences dans la page servie — Vamé
SYLLA au kiosque 7, Aurore CAPLAN au kiosque 9 — et la question 14 du
conducteur, qui citait l'ancienne écriture.

Les cartes de scène sont régénérées : elles relisent les porteurs dans la
page, l'orthographe n'est écrite qu'à un seul endroit.

Co-Authored-By: Claude Opus 5 <noreply@anthropic.com>
Claude-Session: https://claude.ai/code/session_01Pwjz3VzeEknRuHTVSBE4Pa
</commit_message>
<xml_diff>
--- a/outils/fiches/fiches-animateurs.docx
+++ b/outils/fiches/fiches-animateurs.docx
@@ -4062,7 +4062,7 @@
                 <w:color w:val="4A4A49"/>
                 <w:sz w:val="19"/>
               </w:rPr>
-              <w:t>TFC · DF Dommage</w:t>
+              <w:t>TFC · DF Dommages</w:t>
             </w:r>
           </w:p>
         </w:tc>
@@ -4612,7 +4612,7 @@
                 <w:color w:val="4A4A49"/>
                 <w:sz w:val="19"/>
               </w:rPr>
-              <w:t>TFC · DF Dommage</w:t>
+              <w:t>TFC · DF Dommages</w:t>
             </w:r>
           </w:p>
         </w:tc>
@@ -5823,7 +5823,7 @@
                 <w:color w:val="4A4A49"/>
                 <w:sz w:val="19"/>
               </w:rPr>
-              <w:t>Porté par TFC · Vincent TREVARIN / DF Dommage · Aurore CAPLAN.</w:t>
+              <w:t>Porté par TFC · Vincent TREVARIN / DF Dommages · Aurore CAPLAN.</w:t>
             </w:r>
           </w:p>
         </w:tc>
@@ -8449,7 +8449,7 @@
           <w:color w:val="1A1A2E"/>
           <w:sz w:val="28"/>
         </w:rPr>
-        <w:t>Porté par TFC · Vincent TREVARIN / DF Dommage · Aurore CAPLAN.</w:t>
+        <w:t>Porté par TFC · Vincent TREVARIN / DF Dommages · Aurore CAPLAN.</w:t>
       </w:r>
     </w:p>
     <w:tbl>
@@ -14793,7 +14793,7 @@
                 <w:color w:val="4A4A49"/>
                 <w:sz w:val="19"/>
               </w:rPr>
-              <w:t>TFC · DF Dommage</w:t>
+              <w:t>TFC · DF Dommages</w:t>
             </w:r>
           </w:p>
         </w:tc>
@@ -15343,7 +15343,7 @@
                 <w:color w:val="4A4A49"/>
                 <w:sz w:val="19"/>
               </w:rPr>
-              <w:t>TFC · DF Dommage</w:t>
+              <w:t>TFC · DF Dommages</w:t>
             </w:r>
           </w:p>
         </w:tc>
@@ -15856,7 +15856,7 @@
                 <w:color w:val="4A4A49"/>
                 <w:sz w:val="19"/>
               </w:rPr>
-              <w:t>Porté par TFC · Donatien REVEAU et Elodie TORDJMAN / DF Dommage · Vamé SYLLA.</w:t>
+              <w:t>Porté par TFC · Donatien REVEAU et Elodie TORDJMAN / DF Dommages · Vamé SYLLA.</w:t>
             </w:r>
           </w:p>
         </w:tc>
@@ -16774,7 +16774,7 @@
           <w:color w:val="1A1A2E"/>
           <w:sz w:val="28"/>
         </w:rPr>
-        <w:t>Porté par TFC · Donatien REVEAU et Elodie TORDJMAN / DF Dommage · Vamé SYLLA.</w:t>
+        <w:t>Porté par TFC · Donatien REVEAU et Elodie TORDJMAN / DF Dommages · Vamé SYLLA.</w:t>
       </w:r>
     </w:p>
     <w:tbl>

</xml_diff>